<commit_message>
Corrige la contenance 35mL -> 30mL dans le fichier de correspondance Élixir
Cohérence avec la contenance affichée sur le site (site cheiro, commit 39ef010).

Co-Authored-By: Claude Sonnet 5 <noreply@anthropic.com>
</commit_message>
<xml_diff>
--- a/elixirs-correspondance.docx
+++ b/elixirs-correspondance.docx
@@ -171,7 +171,7 @@
               <w:rPr>
                 <w:sz w:val="19"/>
               </w:rPr>
-              <w:t>35 mL / 100 mL</w:t>
+              <w:t>30 mL / 100 mL</w:t>
             </w:r>
           </w:p>
         </w:tc>
@@ -233,7 +233,7 @@
               <w:rPr>
                 <w:sz w:val="19"/>
               </w:rPr>
-              <w:t>35 mL / 100 mL</w:t>
+              <w:t>30 mL / 100 mL</w:t>
             </w:r>
           </w:p>
         </w:tc>
@@ -291,7 +291,7 @@
               <w:rPr>
                 <w:sz w:val="19"/>
               </w:rPr>
-              <w:t>35 mL / 100 mL</w:t>
+              <w:t>30 mL / 100 mL</w:t>
             </w:r>
           </w:p>
         </w:tc>
@@ -353,7 +353,7 @@
               <w:rPr>
                 <w:sz w:val="19"/>
               </w:rPr>
-              <w:t>35 mL / 100 mL</w:t>
+              <w:t>30 mL / 100 mL</w:t>
             </w:r>
           </w:p>
         </w:tc>
@@ -411,7 +411,7 @@
               <w:rPr>
                 <w:sz w:val="19"/>
               </w:rPr>
-              <w:t>35 mL / 100 mL</w:t>
+              <w:t>30 mL / 100 mL</w:t>
             </w:r>
           </w:p>
         </w:tc>
@@ -473,7 +473,7 @@
               <w:rPr>
                 <w:sz w:val="19"/>
               </w:rPr>
-              <w:t>35 mL / 100 mL</w:t>
+              <w:t>30 mL / 100 mL</w:t>
             </w:r>
           </w:p>
         </w:tc>
@@ -531,7 +531,7 @@
               <w:rPr>
                 <w:sz w:val="19"/>
               </w:rPr>
-              <w:t>35 mL / 100 mL</w:t>
+              <w:t>30 mL / 100 mL</w:t>
             </w:r>
           </w:p>
         </w:tc>
@@ -593,7 +593,7 @@
               <w:rPr>
                 <w:sz w:val="19"/>
               </w:rPr>
-              <w:t>35 mL / 100 mL</w:t>
+              <w:t>30 mL / 100 mL</w:t>
             </w:r>
           </w:p>
         </w:tc>
@@ -651,7 +651,7 @@
               <w:rPr>
                 <w:sz w:val="19"/>
               </w:rPr>
-              <w:t>35 mL / 100 mL</w:t>
+              <w:t>30 mL / 100 mL</w:t>
             </w:r>
           </w:p>
         </w:tc>
@@ -713,7 +713,7 @@
               <w:rPr>
                 <w:sz w:val="19"/>
               </w:rPr>
-              <w:t>35 mL / 100 mL</w:t>
+              <w:t>30 mL / 100 mL</w:t>
             </w:r>
           </w:p>
         </w:tc>
@@ -771,7 +771,7 @@
               <w:rPr>
                 <w:sz w:val="19"/>
               </w:rPr>
-              <w:t>35 mL / 100 mL</w:t>
+              <w:t>30 mL / 100 mL</w:t>
             </w:r>
           </w:p>
         </w:tc>
@@ -833,7 +833,7 @@
               <w:rPr>
                 <w:sz w:val="19"/>
               </w:rPr>
-              <w:t>35 mL / 100 mL</w:t>
+              <w:t>30 mL / 100 mL</w:t>
             </w:r>
           </w:p>
         </w:tc>
@@ -891,7 +891,7 @@
               <w:rPr>
                 <w:sz w:val="19"/>
               </w:rPr>
-              <w:t>35 mL / 100 mL</w:t>
+              <w:t>30 mL / 100 mL</w:t>
             </w:r>
           </w:p>
         </w:tc>
@@ -953,7 +953,7 @@
               <w:rPr>
                 <w:sz w:val="19"/>
               </w:rPr>
-              <w:t>35 mL / 100 mL</w:t>
+              <w:t>30 mL / 100 mL</w:t>
             </w:r>
           </w:p>
         </w:tc>
@@ -1011,7 +1011,7 @@
               <w:rPr>
                 <w:sz w:val="19"/>
               </w:rPr>
-              <w:t>35 mL</w:t>
+              <w:t>30 mL</w:t>
             </w:r>
           </w:p>
         </w:tc>
@@ -1073,7 +1073,7 @@
               <w:rPr>
                 <w:sz w:val="19"/>
               </w:rPr>
-              <w:t>35 mL / 100 mL</w:t>
+              <w:t>30 mL / 100 mL</w:t>
             </w:r>
           </w:p>
         </w:tc>
@@ -1131,7 +1131,7 @@
               <w:rPr>
                 <w:sz w:val="19"/>
               </w:rPr>
-              <w:t>35 mL / 100 mL</w:t>
+              <w:t>30 mL / 100 mL</w:t>
             </w:r>
           </w:p>
         </w:tc>
@@ -1193,7 +1193,7 @@
               <w:rPr>
                 <w:sz w:val="19"/>
               </w:rPr>
-              <w:t>35 mL / 100 mL</w:t>
+              <w:t>30 mL / 100 mL</w:t>
             </w:r>
           </w:p>
         </w:tc>
@@ -1251,7 +1251,7 @@
               <w:rPr>
                 <w:sz w:val="19"/>
               </w:rPr>
-              <w:t>35 mL / 100 mL</w:t>
+              <w:t>30 mL / 100 mL</w:t>
             </w:r>
           </w:p>
         </w:tc>
@@ -1313,7 +1313,7 @@
               <w:rPr>
                 <w:sz w:val="19"/>
               </w:rPr>
-              <w:t>35 mL</w:t>
+              <w:t>30 mL</w:t>
             </w:r>
           </w:p>
         </w:tc>
@@ -1371,7 +1371,7 @@
               <w:rPr>
                 <w:sz w:val="19"/>
               </w:rPr>
-              <w:t>35 mL / 100 mL</w:t>
+              <w:t>30 mL / 100 mL</w:t>
             </w:r>
           </w:p>
         </w:tc>
@@ -1433,7 +1433,7 @@
               <w:rPr>
                 <w:sz w:val="19"/>
               </w:rPr>
-              <w:t>35 mL / 100 mL</w:t>
+              <w:t>30 mL / 100 mL</w:t>
             </w:r>
           </w:p>
         </w:tc>
@@ -1491,7 +1491,7 @@
               <w:rPr>
                 <w:sz w:val="19"/>
               </w:rPr>
-              <w:t>35 mL / 100 mL</w:t>
+              <w:t>30 mL / 100 mL</w:t>
             </w:r>
           </w:p>
         </w:tc>
@@ -1553,7 +1553,7 @@
               <w:rPr>
                 <w:sz w:val="19"/>
               </w:rPr>
-              <w:t>35 mL / 100 mL</w:t>
+              <w:t>30 mL / 100 mL</w:t>
             </w:r>
           </w:p>
         </w:tc>
@@ -1611,7 +1611,7 @@
               <w:rPr>
                 <w:sz w:val="19"/>
               </w:rPr>
-              <w:t>35 mL / 100 mL</w:t>
+              <w:t>30 mL / 100 mL</w:t>
             </w:r>
           </w:p>
         </w:tc>
@@ -1673,7 +1673,7 @@
               <w:rPr>
                 <w:sz w:val="19"/>
               </w:rPr>
-              <w:t>35 mL / 100 mL</w:t>
+              <w:t>30 mL / 100 mL</w:t>
             </w:r>
           </w:p>
         </w:tc>
@@ -1731,7 +1731,7 @@
               <w:rPr>
                 <w:sz w:val="19"/>
               </w:rPr>
-              <w:t>35 mL / 100 mL</w:t>
+              <w:t>30 mL / 100 mL</w:t>
             </w:r>
           </w:p>
         </w:tc>
@@ -1793,7 +1793,7 @@
               <w:rPr>
                 <w:sz w:val="19"/>
               </w:rPr>
-              <w:t>35 mL / 100 mL</w:t>
+              <w:t>30 mL / 100 mL</w:t>
             </w:r>
           </w:p>
         </w:tc>
@@ -1851,7 +1851,7 @@
               <w:rPr>
                 <w:sz w:val="19"/>
               </w:rPr>
-              <w:t>35 mL / 100 mL</w:t>
+              <w:t>30 mL / 100 mL</w:t>
             </w:r>
           </w:p>
         </w:tc>
@@ -1913,7 +1913,7 @@
               <w:rPr>
                 <w:sz w:val="19"/>
               </w:rPr>
-              <w:t>35 mL / 100 mL</w:t>
+              <w:t>30 mL / 100 mL</w:t>
             </w:r>
           </w:p>
         </w:tc>
@@ -1971,7 +1971,7 @@
               <w:rPr>
                 <w:sz w:val="19"/>
               </w:rPr>
-              <w:t>35 mL / 100 mL</w:t>
+              <w:t>30 mL / 100 mL</w:t>
             </w:r>
           </w:p>
         </w:tc>
@@ -2033,7 +2033,7 @@
               <w:rPr>
                 <w:sz w:val="19"/>
               </w:rPr>
-              <w:t>35 mL / 100 mL</w:t>
+              <w:t>30 mL / 100 mL</w:t>
             </w:r>
           </w:p>
         </w:tc>
@@ -2091,7 +2091,7 @@
               <w:rPr>
                 <w:sz w:val="19"/>
               </w:rPr>
-              <w:t>35 mL / 100 mL</w:t>
+              <w:t>30 mL / 100 mL</w:t>
             </w:r>
           </w:p>
         </w:tc>
@@ -2153,7 +2153,7 @@
               <w:rPr>
                 <w:sz w:val="19"/>
               </w:rPr>
-              <w:t>35 mL / 100 mL</w:t>
+              <w:t>30 mL / 100 mL</w:t>
             </w:r>
           </w:p>
         </w:tc>
@@ -2211,7 +2211,7 @@
               <w:rPr>
                 <w:sz w:val="19"/>
               </w:rPr>
-              <w:t>35 mL / 100 mL</w:t>
+              <w:t>30 mL / 100 mL</w:t>
             </w:r>
           </w:p>
         </w:tc>
@@ -2273,7 +2273,7 @@
               <w:rPr>
                 <w:sz w:val="19"/>
               </w:rPr>
-              <w:t>35 mL / 100 mL</w:t>
+              <w:t>30 mL / 100 mL</w:t>
             </w:r>
           </w:p>
         </w:tc>
@@ -2331,7 +2331,7 @@
               <w:rPr>
                 <w:sz w:val="19"/>
               </w:rPr>
-              <w:t>35 mL / 100 mL</w:t>
+              <w:t>30 mL / 100 mL</w:t>
             </w:r>
           </w:p>
         </w:tc>
@@ -2393,7 +2393,7 @@
               <w:rPr>
                 <w:sz w:val="19"/>
               </w:rPr>
-              <w:t>35 mL / 100 mL</w:t>
+              <w:t>30 mL / 100 mL</w:t>
             </w:r>
           </w:p>
         </w:tc>
@@ -2451,7 +2451,7 @@
               <w:rPr>
                 <w:sz w:val="19"/>
               </w:rPr>
-              <w:t>35 mL / 100 mL</w:t>
+              <w:t>30 mL / 100 mL</w:t>
             </w:r>
           </w:p>
         </w:tc>
@@ -2513,7 +2513,7 @@
               <w:rPr>
                 <w:sz w:val="19"/>
               </w:rPr>
-              <w:t>35 mL / 100 mL</w:t>
+              <w:t>30 mL / 100 mL</w:t>
             </w:r>
           </w:p>
         </w:tc>
@@ -2571,7 +2571,7 @@
               <w:rPr>
                 <w:sz w:val="19"/>
               </w:rPr>
-              <w:t>35 mL / 100 mL</w:t>
+              <w:t>30 mL / 100 mL</w:t>
             </w:r>
           </w:p>
         </w:tc>
@@ -2633,7 +2633,7 @@
               <w:rPr>
                 <w:sz w:val="19"/>
               </w:rPr>
-              <w:t>35 mL / 100 mL</w:t>
+              <w:t>30 mL / 100 mL</w:t>
             </w:r>
           </w:p>
         </w:tc>
@@ -2691,7 +2691,7 @@
               <w:rPr>
                 <w:sz w:val="19"/>
               </w:rPr>
-              <w:t>35 mL</w:t>
+              <w:t>30 mL</w:t>
             </w:r>
           </w:p>
         </w:tc>
@@ -2753,7 +2753,7 @@
               <w:rPr>
                 <w:sz w:val="19"/>
               </w:rPr>
-              <w:t>35 mL / 100 mL</w:t>
+              <w:t>30 mL / 100 mL</w:t>
             </w:r>
           </w:p>
         </w:tc>
@@ -2811,7 +2811,7 @@
               <w:rPr>
                 <w:sz w:val="19"/>
               </w:rPr>
-              <w:t>35 mL / 100 mL</w:t>
+              <w:t>30 mL / 100 mL</w:t>
             </w:r>
           </w:p>
         </w:tc>
@@ -2873,7 +2873,7 @@
               <w:rPr>
                 <w:sz w:val="19"/>
               </w:rPr>
-              <w:t>35 mL / 100 mL</w:t>
+              <w:t>30 mL / 100 mL</w:t>
             </w:r>
           </w:p>
         </w:tc>
@@ -2931,7 +2931,7 @@
               <w:rPr>
                 <w:sz w:val="19"/>
               </w:rPr>
-              <w:t>35 mL / 100 mL</w:t>
+              <w:t>30 mL / 100 mL</w:t>
             </w:r>
           </w:p>
         </w:tc>
@@ -2993,7 +2993,7 @@
               <w:rPr>
                 <w:sz w:val="19"/>
               </w:rPr>
-              <w:t>35 mL / 100 mL</w:t>
+              <w:t>30 mL / 100 mL</w:t>
             </w:r>
           </w:p>
         </w:tc>
@@ -3051,7 +3051,7 @@
               <w:rPr>
                 <w:sz w:val="19"/>
               </w:rPr>
-              <w:t>35 mL / 100 mL</w:t>
+              <w:t>30 mL / 100 mL</w:t>
             </w:r>
           </w:p>
         </w:tc>
@@ -3113,7 +3113,7 @@
               <w:rPr>
                 <w:sz w:val="19"/>
               </w:rPr>
-              <w:t>35 mL / 100 mL</w:t>
+              <w:t>30 mL / 100 mL</w:t>
             </w:r>
           </w:p>
         </w:tc>
@@ -3171,7 +3171,7 @@
               <w:rPr>
                 <w:sz w:val="19"/>
               </w:rPr>
-              <w:t>35 mL / 100 mL</w:t>
+              <w:t>30 mL / 100 mL</w:t>
             </w:r>
           </w:p>
         </w:tc>
@@ -3233,7 +3233,7 @@
               <w:rPr>
                 <w:sz w:val="19"/>
               </w:rPr>
-              <w:t>35 mL / 100 mL</w:t>
+              <w:t>30 mL / 100 mL</w:t>
             </w:r>
           </w:p>
         </w:tc>
@@ -3291,7 +3291,7 @@
               <w:rPr>
                 <w:sz w:val="19"/>
               </w:rPr>
-              <w:t>35 mL / 100 mL</w:t>
+              <w:t>30 mL / 100 mL</w:t>
             </w:r>
           </w:p>
         </w:tc>
@@ -3353,7 +3353,7 @@
               <w:rPr>
                 <w:sz w:val="19"/>
               </w:rPr>
-              <w:t>35 mL / 100 mL</w:t>
+              <w:t>30 mL / 100 mL</w:t>
             </w:r>
           </w:p>
         </w:tc>
@@ -3411,7 +3411,7 @@
               <w:rPr>
                 <w:sz w:val="19"/>
               </w:rPr>
-              <w:t>35 mL / 100 mL</w:t>
+              <w:t>30 mL / 100 mL</w:t>
             </w:r>
           </w:p>
         </w:tc>
@@ -3473,7 +3473,7 @@
               <w:rPr>
                 <w:sz w:val="19"/>
               </w:rPr>
-              <w:t>35 mL / 100 mL</w:t>
+              <w:t>30 mL / 100 mL</w:t>
             </w:r>
           </w:p>
         </w:tc>
@@ -3531,7 +3531,7 @@
               <w:rPr>
                 <w:sz w:val="19"/>
               </w:rPr>
-              <w:t>35 mL</w:t>
+              <w:t>30 mL</w:t>
             </w:r>
           </w:p>
         </w:tc>
@@ -3593,7 +3593,7 @@
               <w:rPr>
                 <w:sz w:val="19"/>
               </w:rPr>
-              <w:t>35 mL</w:t>
+              <w:t>30 mL</w:t>
             </w:r>
           </w:p>
         </w:tc>
@@ -3651,7 +3651,7 @@
               <w:rPr>
                 <w:sz w:val="19"/>
               </w:rPr>
-              <w:t>35 mL</w:t>
+              <w:t>30 mL</w:t>
             </w:r>
           </w:p>
         </w:tc>
@@ -3713,7 +3713,7 @@
               <w:rPr>
                 <w:sz w:val="19"/>
               </w:rPr>
-              <w:t>35 mL</w:t>
+              <w:t>30 mL</w:t>
             </w:r>
           </w:p>
         </w:tc>
@@ -3771,7 +3771,7 @@
               <w:rPr>
                 <w:sz w:val="19"/>
               </w:rPr>
-              <w:t>35 mL</w:t>
+              <w:t>30 mL</w:t>
             </w:r>
           </w:p>
         </w:tc>
@@ -3833,7 +3833,7 @@
               <w:rPr>
                 <w:sz w:val="19"/>
               </w:rPr>
-              <w:t>35 mL</w:t>
+              <w:t>30 mL</w:t>
             </w:r>
           </w:p>
         </w:tc>
@@ -3891,7 +3891,7 @@
               <w:rPr>
                 <w:sz w:val="19"/>
               </w:rPr>
-              <w:t>35 mL / 100 mL</w:t>
+              <w:t>30 mL / 100 mL</w:t>
             </w:r>
           </w:p>
         </w:tc>
@@ -3953,7 +3953,7 @@
               <w:rPr>
                 <w:sz w:val="19"/>
               </w:rPr>
-              <w:t>35 mL</w:t>
+              <w:t>30 mL</w:t>
             </w:r>
           </w:p>
         </w:tc>
@@ -4011,7 +4011,7 @@
               <w:rPr>
                 <w:sz w:val="19"/>
               </w:rPr>
-              <w:t>35 mL</w:t>
+              <w:t>30 mL</w:t>
             </w:r>
           </w:p>
         </w:tc>
@@ -4073,7 +4073,7 @@
               <w:rPr>
                 <w:sz w:val="19"/>
               </w:rPr>
-              <w:t>35 mL / 100 mL</w:t>
+              <w:t>30 mL / 100 mL</w:t>
             </w:r>
           </w:p>
         </w:tc>
@@ -4131,7 +4131,7 @@
               <w:rPr>
                 <w:sz w:val="19"/>
               </w:rPr>
-              <w:t>35 mL / 100 mL</w:t>
+              <w:t>30 mL / 100 mL</w:t>
             </w:r>
           </w:p>
         </w:tc>
@@ -4193,7 +4193,7 @@
               <w:rPr>
                 <w:sz w:val="19"/>
               </w:rPr>
-              <w:t>35 mL / 100 mL</w:t>
+              <w:t>30 mL / 100 mL</w:t>
             </w:r>
           </w:p>
         </w:tc>
@@ -4251,7 +4251,7 @@
               <w:rPr>
                 <w:sz w:val="19"/>
               </w:rPr>
-              <w:t>35 mL / 100 mL</w:t>
+              <w:t>30 mL / 100 mL</w:t>
             </w:r>
           </w:p>
         </w:tc>
@@ -4313,7 +4313,7 @@
               <w:rPr>
                 <w:sz w:val="19"/>
               </w:rPr>
-              <w:t>35 mL / 100 mL</w:t>
+              <w:t>30 mL / 100 mL</w:t>
             </w:r>
           </w:p>
         </w:tc>
@@ -4371,7 +4371,7 @@
               <w:rPr>
                 <w:sz w:val="19"/>
               </w:rPr>
-              <w:t>35 mL / 100 mL</w:t>
+              <w:t>30 mL / 100 mL</w:t>
             </w:r>
           </w:p>
         </w:tc>
@@ -4433,7 +4433,7 @@
               <w:rPr>
                 <w:sz w:val="19"/>
               </w:rPr>
-              <w:t>35 mL / 100 mL</w:t>
+              <w:t>30 mL / 100 mL</w:t>
             </w:r>
           </w:p>
         </w:tc>
@@ -4491,7 +4491,7 @@
               <w:rPr>
                 <w:sz w:val="19"/>
               </w:rPr>
-              <w:t>35 mL / 100 mL</w:t>
+              <w:t>30 mL / 100 mL</w:t>
             </w:r>
           </w:p>
         </w:tc>
@@ -4553,7 +4553,7 @@
               <w:rPr>
                 <w:sz w:val="19"/>
               </w:rPr>
-              <w:t>35 mL / 100 mL</w:t>
+              <w:t>30 mL / 100 mL</w:t>
             </w:r>
           </w:p>
         </w:tc>
@@ -4611,7 +4611,7 @@
               <w:rPr>
                 <w:sz w:val="19"/>
               </w:rPr>
-              <w:t>35 mL / 100 mL</w:t>
+              <w:t>30 mL / 100 mL</w:t>
             </w:r>
           </w:p>
         </w:tc>
@@ -4673,7 +4673,7 @@
               <w:rPr>
                 <w:sz w:val="19"/>
               </w:rPr>
-              <w:t>35 mL / 100 mL</w:t>
+              <w:t>30 mL / 100 mL</w:t>
             </w:r>
           </w:p>
         </w:tc>
@@ -4731,7 +4731,7 @@
               <w:rPr>
                 <w:sz w:val="19"/>
               </w:rPr>
-              <w:t>35 mL / 100 mL</w:t>
+              <w:t>30 mL / 100 mL</w:t>
             </w:r>
           </w:p>
         </w:tc>
@@ -4793,7 +4793,7 @@
               <w:rPr>
                 <w:sz w:val="19"/>
               </w:rPr>
-              <w:t>35 mL / 100 mL</w:t>
+              <w:t>30 mL / 100 mL</w:t>
             </w:r>
           </w:p>
         </w:tc>
@@ -4851,7 +4851,7 @@
               <w:rPr>
                 <w:sz w:val="19"/>
               </w:rPr>
-              <w:t>35 mL / 100 mL</w:t>
+              <w:t>30 mL / 100 mL</w:t>
             </w:r>
           </w:p>
         </w:tc>
@@ -4913,7 +4913,7 @@
               <w:rPr>
                 <w:sz w:val="19"/>
               </w:rPr>
-              <w:t>35 mL / 100 mL</w:t>
+              <w:t>30 mL / 100 mL</w:t>
             </w:r>
           </w:p>
         </w:tc>
@@ -4971,7 +4971,7 @@
               <w:rPr>
                 <w:sz w:val="19"/>
               </w:rPr>
-              <w:t>35 mL / 100 mL</w:t>
+              <w:t>30 mL / 100 mL</w:t>
             </w:r>
           </w:p>
         </w:tc>
@@ -5033,7 +5033,7 @@
               <w:rPr>
                 <w:sz w:val="19"/>
               </w:rPr>
-              <w:t>35 mL / 100 mL</w:t>
+              <w:t>30 mL / 100 mL</w:t>
             </w:r>
           </w:p>
         </w:tc>
@@ -5091,7 +5091,7 @@
               <w:rPr>
                 <w:sz w:val="19"/>
               </w:rPr>
-              <w:t>35 mL / 100 mL</w:t>
+              <w:t>30 mL / 100 mL</w:t>
             </w:r>
           </w:p>
         </w:tc>
@@ -5153,7 +5153,7 @@
               <w:rPr>
                 <w:sz w:val="19"/>
               </w:rPr>
-              <w:t>35 mL / 100 mL</w:t>
+              <w:t>30 mL / 100 mL</w:t>
             </w:r>
           </w:p>
         </w:tc>
@@ -5211,7 +5211,7 @@
               <w:rPr>
                 <w:sz w:val="19"/>
               </w:rPr>
-              <w:t>35 mL / 100 mL</w:t>
+              <w:t>30 mL / 100 mL</w:t>
             </w:r>
           </w:p>
         </w:tc>
@@ -5273,7 +5273,7 @@
               <w:rPr>
                 <w:sz w:val="19"/>
               </w:rPr>
-              <w:t>35 mL / 100 mL</w:t>
+              <w:t>30 mL / 100 mL</w:t>
             </w:r>
           </w:p>
         </w:tc>
@@ -5331,7 +5331,7 @@
               <w:rPr>
                 <w:sz w:val="19"/>
               </w:rPr>
-              <w:t>35 mL / 100 mL</w:t>
+              <w:t>30 mL / 100 mL</w:t>
             </w:r>
           </w:p>
         </w:tc>
@@ -5393,7 +5393,7 @@
               <w:rPr>
                 <w:sz w:val="19"/>
               </w:rPr>
-              <w:t>35 mL / 100 mL</w:t>
+              <w:t>30 mL / 100 mL</w:t>
             </w:r>
           </w:p>
         </w:tc>
@@ -5451,7 +5451,7 @@
               <w:rPr>
                 <w:sz w:val="19"/>
               </w:rPr>
-              <w:t>35 mL / 100 mL</w:t>
+              <w:t>30 mL / 100 mL</w:t>
             </w:r>
           </w:p>
         </w:tc>
@@ -5513,7 +5513,7 @@
               <w:rPr>
                 <w:sz w:val="19"/>
               </w:rPr>
-              <w:t>35 mL / 100 mL</w:t>
+              <w:t>30 mL / 100 mL</w:t>
             </w:r>
           </w:p>
         </w:tc>
@@ -5571,7 +5571,7 @@
               <w:rPr>
                 <w:sz w:val="19"/>
               </w:rPr>
-              <w:t>35 mL / 100 mL</w:t>
+              <w:t>30 mL / 100 mL</w:t>
             </w:r>
           </w:p>
         </w:tc>
@@ -5633,7 +5633,7 @@
               <w:rPr>
                 <w:sz w:val="19"/>
               </w:rPr>
-              <w:t>35 mL / 100 mL</w:t>
+              <w:t>30 mL / 100 mL</w:t>
             </w:r>
           </w:p>
         </w:tc>
@@ -5691,7 +5691,7 @@
               <w:rPr>
                 <w:sz w:val="19"/>
               </w:rPr>
-              <w:t>35 mL / 100 mL</w:t>
+              <w:t>30 mL / 100 mL</w:t>
             </w:r>
           </w:p>
         </w:tc>
@@ -5753,7 +5753,7 @@
               <w:rPr>
                 <w:sz w:val="19"/>
               </w:rPr>
-              <w:t>35 mL / 100 mL</w:t>
+              <w:t>30 mL / 100 mL</w:t>
             </w:r>
           </w:p>
         </w:tc>
@@ -5811,7 +5811,7 @@
               <w:rPr>
                 <w:sz w:val="19"/>
               </w:rPr>
-              <w:t>35 mL / 100 mL</w:t>
+              <w:t>30 mL / 100 mL</w:t>
             </w:r>
           </w:p>
         </w:tc>
@@ -5873,7 +5873,7 @@
               <w:rPr>
                 <w:sz w:val="19"/>
               </w:rPr>
-              <w:t>35 mL / 100 mL</w:t>
+              <w:t>30 mL / 100 mL</w:t>
             </w:r>
           </w:p>
         </w:tc>
@@ -5931,7 +5931,7 @@
               <w:rPr>
                 <w:sz w:val="19"/>
               </w:rPr>
-              <w:t>35 mL / 100 mL</w:t>
+              <w:t>30 mL / 100 mL</w:t>
             </w:r>
           </w:p>
         </w:tc>
@@ -5993,7 +5993,7 @@
               <w:rPr>
                 <w:sz w:val="19"/>
               </w:rPr>
-              <w:t>35 mL / 100 mL</w:t>
+              <w:t>30 mL / 100 mL</w:t>
             </w:r>
           </w:p>
         </w:tc>
@@ -6051,7 +6051,7 @@
               <w:rPr>
                 <w:sz w:val="19"/>
               </w:rPr>
-              <w:t>35 mL / 100 mL</w:t>
+              <w:t>30 mL / 100 mL</w:t>
             </w:r>
           </w:p>
         </w:tc>
@@ -6113,7 +6113,7 @@
               <w:rPr>
                 <w:sz w:val="19"/>
               </w:rPr>
-              <w:t>35 mL / 100 mL</w:t>
+              <w:t>30 mL / 100 mL</w:t>
             </w:r>
           </w:p>
         </w:tc>
@@ -6171,7 +6171,7 @@
               <w:rPr>
                 <w:sz w:val="19"/>
               </w:rPr>
-              <w:t>35 mL / 100 mL</w:t>
+              <w:t>30 mL / 100 mL</w:t>
             </w:r>
           </w:p>
         </w:tc>
@@ -6233,7 +6233,7 @@
               <w:rPr>
                 <w:sz w:val="19"/>
               </w:rPr>
-              <w:t>35 mL</w:t>
+              <w:t>30 mL</w:t>
             </w:r>
           </w:p>
         </w:tc>
@@ -6291,7 +6291,7 @@
               <w:rPr>
                 <w:sz w:val="19"/>
               </w:rPr>
-              <w:t>35 mL</w:t>
+              <w:t>30 mL</w:t>
             </w:r>
           </w:p>
         </w:tc>
@@ -6353,7 +6353,7 @@
               <w:rPr>
                 <w:sz w:val="19"/>
               </w:rPr>
-              <w:t>35 mL</w:t>
+              <w:t>30 mL</w:t>
             </w:r>
           </w:p>
         </w:tc>
@@ -6411,7 +6411,7 @@
               <w:rPr>
                 <w:sz w:val="19"/>
               </w:rPr>
-              <w:t>35 mL / 100 mL</w:t>
+              <w:t>30 mL / 100 mL</w:t>
             </w:r>
           </w:p>
         </w:tc>
@@ -6473,7 +6473,7 @@
               <w:rPr>
                 <w:sz w:val="19"/>
               </w:rPr>
-              <w:t>35 mL</w:t>
+              <w:t>30 mL</w:t>
             </w:r>
           </w:p>
         </w:tc>
@@ -6531,7 +6531,7 @@
               <w:rPr>
                 <w:sz w:val="19"/>
               </w:rPr>
-              <w:t>35 mL / 100 mL</w:t>
+              <w:t>30 mL / 100 mL</w:t>
             </w:r>
           </w:p>
         </w:tc>
@@ -6593,7 +6593,7 @@
               <w:rPr>
                 <w:sz w:val="19"/>
               </w:rPr>
-              <w:t>35 mL</w:t>
+              <w:t>30 mL</w:t>
             </w:r>
           </w:p>
         </w:tc>
@@ -6651,7 +6651,7 @@
               <w:rPr>
                 <w:sz w:val="19"/>
               </w:rPr>
-              <w:t>35 mL</w:t>
+              <w:t>30 mL</w:t>
             </w:r>
           </w:p>
         </w:tc>
@@ -6713,7 +6713,7 @@
               <w:rPr>
                 <w:sz w:val="19"/>
               </w:rPr>
-              <w:t>35 mL / 100 mL</w:t>
+              <w:t>30 mL / 100 mL</w:t>
             </w:r>
           </w:p>
         </w:tc>
@@ -6771,7 +6771,7 @@
               <w:rPr>
                 <w:sz w:val="19"/>
               </w:rPr>
-              <w:t>35 mL / 100 mL</w:t>
+              <w:t>30 mL / 100 mL</w:t>
             </w:r>
           </w:p>
         </w:tc>
@@ -6833,7 +6833,7 @@
               <w:rPr>
                 <w:sz w:val="19"/>
               </w:rPr>
-              <w:t>35 mL / 100 mL</w:t>
+              <w:t>30 mL / 100 mL</w:t>
             </w:r>
           </w:p>
         </w:tc>
@@ -6891,7 +6891,7 @@
               <w:rPr>
                 <w:sz w:val="19"/>
               </w:rPr>
-              <w:t>35 mL</w:t>
+              <w:t>30 mL</w:t>
             </w:r>
           </w:p>
         </w:tc>
@@ -6953,7 +6953,7 @@
               <w:rPr>
                 <w:sz w:val="19"/>
               </w:rPr>
-              <w:t>35 mL</w:t>
+              <w:t>30 mL</w:t>
             </w:r>
           </w:p>
         </w:tc>
@@ -7011,7 +7011,7 @@
               <w:rPr>
                 <w:sz w:val="19"/>
               </w:rPr>
-              <w:t>35 mL</w:t>
+              <w:t>30 mL</w:t>
             </w:r>
           </w:p>
         </w:tc>
@@ -7073,7 +7073,7 @@
               <w:rPr>
                 <w:sz w:val="19"/>
               </w:rPr>
-              <w:t>35 mL / 100 mL</w:t>
+              <w:t>30 mL / 100 mL</w:t>
             </w:r>
           </w:p>
         </w:tc>
@@ -7131,7 +7131,7 @@
               <w:rPr>
                 <w:sz w:val="19"/>
               </w:rPr>
-              <w:t>35 mL</w:t>
+              <w:t>30 mL</w:t>
             </w:r>
           </w:p>
         </w:tc>
@@ -7193,7 +7193,7 @@
               <w:rPr>
                 <w:sz w:val="19"/>
               </w:rPr>
-              <w:t>35 mL / 100 mL</w:t>
+              <w:t>30 mL / 100 mL</w:t>
             </w:r>
           </w:p>
         </w:tc>
@@ -7251,7 +7251,7 @@
               <w:rPr>
                 <w:sz w:val="19"/>
               </w:rPr>
-              <w:t>35 mL</w:t>
+              <w:t>30 mL</w:t>
             </w:r>
           </w:p>
         </w:tc>
@@ -7313,7 +7313,7 @@
               <w:rPr>
                 <w:sz w:val="19"/>
               </w:rPr>
-              <w:t>35 mL</w:t>
+              <w:t>30 mL</w:t>
             </w:r>
           </w:p>
         </w:tc>
@@ -7371,7 +7371,7 @@
               <w:rPr>
                 <w:sz w:val="19"/>
               </w:rPr>
-              <w:t>35 mL</w:t>
+              <w:t>30 mL</w:t>
             </w:r>
           </w:p>
         </w:tc>
@@ -7433,7 +7433,7 @@
               <w:rPr>
                 <w:sz w:val="19"/>
               </w:rPr>
-              <w:t>35 mL / 100 mL</w:t>
+              <w:t>30 mL / 100 mL</w:t>
             </w:r>
           </w:p>
         </w:tc>
@@ -7491,7 +7491,7 @@
               <w:rPr>
                 <w:sz w:val="19"/>
               </w:rPr>
-              <w:t>35 mL / 100 mL</w:t>
+              <w:t>30 mL / 100 mL</w:t>
             </w:r>
           </w:p>
         </w:tc>
@@ -7553,7 +7553,7 @@
               <w:rPr>
                 <w:sz w:val="19"/>
               </w:rPr>
-              <w:t>35 mL</w:t>
+              <w:t>30 mL</w:t>
             </w:r>
           </w:p>
         </w:tc>
@@ -7611,7 +7611,7 @@
               <w:rPr>
                 <w:sz w:val="19"/>
               </w:rPr>
-              <w:t>35 mL / 100 mL</w:t>
+              <w:t>30 mL / 100 mL</w:t>
             </w:r>
           </w:p>
         </w:tc>
@@ -7673,7 +7673,7 @@
               <w:rPr>
                 <w:sz w:val="19"/>
               </w:rPr>
-              <w:t>35 mL / 100 mL</w:t>
+              <w:t>30 mL / 100 mL</w:t>
             </w:r>
           </w:p>
         </w:tc>
@@ -7731,7 +7731,7 @@
               <w:rPr>
                 <w:sz w:val="19"/>
               </w:rPr>
-              <w:t>35 mL / 100 mL</w:t>
+              <w:t>30 mL / 100 mL</w:t>
             </w:r>
           </w:p>
         </w:tc>
@@ -7793,7 +7793,7 @@
               <w:rPr>
                 <w:sz w:val="19"/>
               </w:rPr>
-              <w:t>35 mL / 100 mL</w:t>
+              <w:t>30 mL / 100 mL</w:t>
             </w:r>
           </w:p>
         </w:tc>
@@ -7851,7 +7851,7 @@
               <w:rPr>
                 <w:sz w:val="19"/>
               </w:rPr>
-              <w:t>35 mL</w:t>
+              <w:t>30 mL</w:t>
             </w:r>
           </w:p>
         </w:tc>
@@ -7913,7 +7913,7 @@
               <w:rPr>
                 <w:sz w:val="19"/>
               </w:rPr>
-              <w:t>35 mL</w:t>
+              <w:t>30 mL</w:t>
             </w:r>
           </w:p>
         </w:tc>
@@ -7971,7 +7971,7 @@
               <w:rPr>
                 <w:sz w:val="19"/>
               </w:rPr>
-              <w:t>35 mL / 100 mL</w:t>
+              <w:t>30 mL / 100 mL</w:t>
             </w:r>
           </w:p>
         </w:tc>
@@ -8033,7 +8033,7 @@
               <w:rPr>
                 <w:sz w:val="19"/>
               </w:rPr>
-              <w:t>35 mL / 100 mL</w:t>
+              <w:t>30 mL / 100 mL</w:t>
             </w:r>
           </w:p>
         </w:tc>
@@ -8091,7 +8091,7 @@
               <w:rPr>
                 <w:sz w:val="19"/>
               </w:rPr>
-              <w:t>35 mL</w:t>
+              <w:t>30 mL</w:t>
             </w:r>
           </w:p>
         </w:tc>
@@ -8153,7 +8153,7 @@
               <w:rPr>
                 <w:sz w:val="19"/>
               </w:rPr>
-              <w:t>35 mL / 100 mL</w:t>
+              <w:t>30 mL / 100 mL</w:t>
             </w:r>
           </w:p>
         </w:tc>
@@ -8211,7 +8211,7 @@
               <w:rPr>
                 <w:sz w:val="19"/>
               </w:rPr>
-              <w:t>35 mL</w:t>
+              <w:t>30 mL</w:t>
             </w:r>
           </w:p>
         </w:tc>
@@ -8273,7 +8273,7 @@
               <w:rPr>
                 <w:sz w:val="19"/>
               </w:rPr>
-              <w:t>35 mL</w:t>
+              <w:t>30 mL</w:t>
             </w:r>
           </w:p>
         </w:tc>
@@ -8331,7 +8331,7 @@
               <w:rPr>
                 <w:sz w:val="19"/>
               </w:rPr>
-              <w:t>35 mL / 100 mL</w:t>
+              <w:t>30 mL / 100 mL</w:t>
             </w:r>
           </w:p>
         </w:tc>
@@ -8393,7 +8393,7 @@
               <w:rPr>
                 <w:sz w:val="19"/>
               </w:rPr>
-              <w:t>35 mL</w:t>
+              <w:t>30 mL</w:t>
             </w:r>
           </w:p>
         </w:tc>
@@ -8451,7 +8451,7 @@
               <w:rPr>
                 <w:sz w:val="19"/>
               </w:rPr>
-              <w:t>35 mL</w:t>
+              <w:t>30 mL</w:t>
             </w:r>
           </w:p>
         </w:tc>
@@ -8513,7 +8513,7 @@
               <w:rPr>
                 <w:sz w:val="19"/>
               </w:rPr>
-              <w:t>35 mL</w:t>
+              <w:t>30 mL</w:t>
             </w:r>
           </w:p>
         </w:tc>
@@ -8571,7 +8571,7 @@
               <w:rPr>
                 <w:sz w:val="19"/>
               </w:rPr>
-              <w:t>35 mL</w:t>
+              <w:t>30 mL</w:t>
             </w:r>
           </w:p>
         </w:tc>
@@ -8633,7 +8633,7 @@
               <w:rPr>
                 <w:sz w:val="19"/>
               </w:rPr>
-              <w:t>35 mL</w:t>
+              <w:t>30 mL</w:t>
             </w:r>
           </w:p>
         </w:tc>
@@ -8691,7 +8691,7 @@
               <w:rPr>
                 <w:sz w:val="19"/>
               </w:rPr>
-              <w:t>35 mL</w:t>
+              <w:t>30 mL</w:t>
             </w:r>
           </w:p>
         </w:tc>
@@ -8753,7 +8753,7 @@
               <w:rPr>
                 <w:sz w:val="19"/>
               </w:rPr>
-              <w:t>35 mL</w:t>
+              <w:t>30 mL</w:t>
             </w:r>
           </w:p>
         </w:tc>
@@ -8811,7 +8811,7 @@
               <w:rPr>
                 <w:sz w:val="19"/>
               </w:rPr>
-              <w:t>35 mL</w:t>
+              <w:t>30 mL</w:t>
             </w:r>
           </w:p>
         </w:tc>
@@ -8873,7 +8873,7 @@
               <w:rPr>
                 <w:sz w:val="19"/>
               </w:rPr>
-              <w:t>35 mL</w:t>
+              <w:t>30 mL</w:t>
             </w:r>
           </w:p>
         </w:tc>
@@ -8931,7 +8931,7 @@
               <w:rPr>
                 <w:sz w:val="19"/>
               </w:rPr>
-              <w:t>35 mL</w:t>
+              <w:t>30 mL</w:t>
             </w:r>
           </w:p>
         </w:tc>
@@ -8993,7 +8993,7 @@
               <w:rPr>
                 <w:sz w:val="19"/>
               </w:rPr>
-              <w:t>35 mL</w:t>
+              <w:t>30 mL</w:t>
             </w:r>
           </w:p>
         </w:tc>
@@ -9051,7 +9051,7 @@
               <w:rPr>
                 <w:sz w:val="19"/>
               </w:rPr>
-              <w:t>35 mL</w:t>
+              <w:t>30 mL</w:t>
             </w:r>
           </w:p>
         </w:tc>
@@ -9113,7 +9113,7 @@
               <w:rPr>
                 <w:sz w:val="19"/>
               </w:rPr>
-              <w:t>35 mL / 100 mL</w:t>
+              <w:t>30 mL / 100 mL</w:t>
             </w:r>
           </w:p>
         </w:tc>
@@ -9171,7 +9171,7 @@
               <w:rPr>
                 <w:sz w:val="19"/>
               </w:rPr>
-              <w:t>35 mL</w:t>
+              <w:t>30 mL</w:t>
             </w:r>
           </w:p>
         </w:tc>
@@ -9233,7 +9233,7 @@
               <w:rPr>
                 <w:sz w:val="19"/>
               </w:rPr>
-              <w:t>35 mL</w:t>
+              <w:t>30 mL</w:t>
             </w:r>
           </w:p>
         </w:tc>
@@ -9291,7 +9291,7 @@
               <w:rPr>
                 <w:sz w:val="19"/>
               </w:rPr>
-              <w:t>35 mL</w:t>
+              <w:t>30 mL</w:t>
             </w:r>
           </w:p>
         </w:tc>
@@ -9353,7 +9353,7 @@
               <w:rPr>
                 <w:sz w:val="19"/>
               </w:rPr>
-              <w:t>35 mL</w:t>
+              <w:t>30 mL</w:t>
             </w:r>
           </w:p>
         </w:tc>

</xml_diff>